<commit_message>
Add developer documents  and prompts
</commit_message>
<xml_diff>
--- a/docs/Second-Brain-Design-Document.docx
+++ b/docs/Second-Brain-Design-Document.docx
@@ -770,6 +770,164 @@
           <w:szCs w:val="21"/>
         </w:rPr>
         <w:t xml:space="preserve">This loop deliberately starts conservative: patterns are first reported descriptively (“over recent weeks your productivity tends to be lower during period X”), moving to prediction only after enough data accumulates — or not at all. The aim is to keep self-observation from turning into anxious self-optimization.</w:t>
+      </w:r>
+    </w:p>
+    <w:p>
+      <w:pPr>
+        <w:pStyle w:val="Heading2"/>
+        <w:spacing w:after="80" w:before="180"/>
+      </w:pPr>
+      <w:r>
+        <w:rPr>
+          <w:b/>
+          <w:bCs/>
+        </w:rPr>
+        <w:t xml:space="preserve">2.3. Interaction Principles — act, don’t chat</w:t>
+      </w:r>
+    </w:p>
+    <w:p>
+      <w:pPr>
+        <w:spacing w:after="100"/>
+        <w:jc w:val="both"/>
+      </w:pPr>
+      <w:r>
+        <w:rPr>
+          <w:sz w:val="21"/>
+          <w:szCs w:val="21"/>
+        </w:rPr>
+        <w:t xml:space="preserve">The assistant is an agent that does things, not a chatbot that answers. This shapes every user-facing message and is deliberately the opposite of ordinary chat-assistant behavior. It is enforced in the orchestrator’s system prompt.</w:t>
+      </w:r>
+    </w:p>
+    <w:p>
+      <w:pPr>
+        <w:pStyle w:val="ListParagraph"/>
+        <w:numPr>
+          <w:ilvl w:val="0"/>
+          <w:numId w:val="2"/>
+        </w:numPr>
+        <w:spacing w:after="40"/>
+      </w:pPr>
+      <w:r>
+        <w:rPr>
+          <w:b/>
+          <w:bCs/>
+          <w:sz w:val="21"/>
+          <w:szCs w:val="21"/>
+        </w:rPr>
+        <w:t xml:space="preserve">Act, don’t discuss. </w:t>
+      </w:r>
+      <w:r>
+        <w:rPr>
+          <w:sz w:val="21"/>
+          <w:szCs w:val="21"/>
+        </w:rPr>
+        <w:t xml:space="preserve">Treat an input as a task to carry out with tools, not a question to answer. Do the work, then report it.</w:t>
+      </w:r>
+    </w:p>
+    <w:p>
+      <w:pPr>
+        <w:pStyle w:val="ListParagraph"/>
+        <w:numPr>
+          <w:ilvl w:val="0"/>
+          <w:numId w:val="2"/>
+        </w:numPr>
+        <w:spacing w:after="40"/>
+      </w:pPr>
+      <w:r>
+        <w:rPr>
+          <w:b/>
+          <w:bCs/>
+          <w:sz w:val="21"/>
+          <w:szCs w:val="21"/>
+        </w:rPr>
+        <w:t xml:space="preserve">Receipts, not essays. </w:t>
+      </w:r>
+      <w:r>
+        <w:rPr>
+          <w:sz w:val="21"/>
+          <w:szCs w:val="21"/>
+        </w:rPr>
+        <w:t xml:space="preserve">After a tool runs, confirm in one short line what was done — no filler, no “anything else?” closers, no restating the request.</w:t>
+      </w:r>
+    </w:p>
+    <w:p>
+      <w:pPr>
+        <w:pStyle w:val="ListParagraph"/>
+        <w:numPr>
+          <w:ilvl w:val="0"/>
+          <w:numId w:val="2"/>
+        </w:numPr>
+        <w:spacing w:after="40"/>
+      </w:pPr>
+      <w:r>
+        <w:rPr>
+          <w:b/>
+          <w:bCs/>
+          <w:sz w:val="21"/>
+          <w:szCs w:val="21"/>
+        </w:rPr>
+        <w:t xml:space="preserve">Assume, don’t interrogate. </w:t>
+      </w:r>
+      <w:r>
+        <w:rPr>
+          <w:sz w:val="21"/>
+          <w:szCs w:val="21"/>
+        </w:rPr>
+        <w:t xml:space="preserve">On ambiguity, act on the most reasonable interpretation and state the assumption in a few words; ask a question only when genuinely blocked — a missing required value, or a destructive/irreversible action.</w:t>
+      </w:r>
+    </w:p>
+    <w:p>
+      <w:pPr>
+        <w:pStyle w:val="ListParagraph"/>
+        <w:numPr>
+          <w:ilvl w:val="0"/>
+          <w:numId w:val="2"/>
+        </w:numPr>
+        <w:spacing w:after="40"/>
+      </w:pPr>
+      <w:r>
+        <w:rPr>
+          <w:b/>
+          <w:bCs/>
+          <w:sz w:val="21"/>
+          <w:szCs w:val="21"/>
+        </w:rPr>
+        <w:t xml:space="preserve">Terse by default, with an escape hatch. </w:t>
+      </w:r>
+      <w:r>
+        <w:rPr>
+          <w:sz w:val="21"/>
+          <w:szCs w:val="21"/>
+        </w:rPr>
+        <w:t xml:space="preserve">Keep replies to a line or two; on a command like “detail” or “explain”, switch to a full explanation for that turn, then return to terse mode.</w:t>
+      </w:r>
+    </w:p>
+    <w:p>
+      <w:pPr>
+        <w:spacing w:after="40" w:before="60"/>
+      </w:pPr>
+      <w:r>
+        <w:rPr>
+          <w:i/>
+          <w:iCs/>
+          <w:sz w:val="21"/>
+          <w:szCs w:val="21"/>
+        </w:rPr>
+        <w:t xml:space="preserve">Example receipt:</w:t>
+      </w:r>
+    </w:p>
+    <w:p>
+      <w:pPr>
+        <w:spacing w:after="140"/>
+      </w:pPr>
+      <w:r>
+        <w:rPr>
+          <w:rFonts w:ascii="Consolas" w:cs="Consolas" w:eastAsia="Consolas" w:hAnsi="Consolas"/>
+          <w:color w:val="137333"/>
+          <w:sz w:val="19"/>
+          <w:szCs w:val="19"/>
+        </w:rPr>
+        <w:t xml:space="preserve">✓ Saved → bookmarks · tags: gadget, wishlist · reminder Oct 2</w:t>
       </w:r>
     </w:p>
     <w:p>

</xml_diff>